<commit_message>
Resume new security certification updated in resume and portfolio
Resume new security certification updated in resume and portfolio
</commit_message>
<xml_diff>
--- a/resume/WORD/my-resume-profiles.docx
+++ b/resume/WORD/my-resume-profiles.docx
@@ -1877,7 +1877,6 @@
         </w:rPr>
         <w:t xml:space="preserve"> Core</w:t>
       </w:r>
-      <w:proofErr w:type="gramStart"/>
       <w:r>
         <w:rPr>
           <w:rFonts w:ascii="Tahoma" w:hAnsi="Tahoma" w:cs="Tahoma"/>
@@ -1896,18 +1895,7 @@
           <w:sz w:val="19"/>
           <w:szCs w:val="19"/>
         </w:rPr>
-        <w:t xml:space="preserve"> .Net</w:t>
-      </w:r>
-      <w:proofErr w:type="gramEnd"/>
-      <w:r>
-        <w:rPr>
-          <w:rFonts w:ascii="Tahoma" w:hAnsi="Tahoma" w:cs="Tahoma"/>
-          <w:i/>
-          <w:color w:val="333333"/>
-          <w:sz w:val="19"/>
-          <w:szCs w:val="19"/>
-        </w:rPr>
-        <w:t>8,</w:t>
+        <w:t xml:space="preserve"> .Net8,</w:t>
       </w:r>
       <w:r>
         <w:rPr>
@@ -4740,10 +4728,8 @@
         <w:pStyle w:val="Title"/>
         <w:rPr>
           <w:rFonts w:ascii="Tahoma" w:eastAsiaTheme="minorHAnsi" w:hAnsi="Tahoma" w:cs="Tahoma"/>
-          <w:b w:val="0"/>
-          <w:color w:val="333333"/>
-          <w:spacing w:val="0"/>
-          <w:kern w:val="0"/>
+          <w:bCs/>
+          <w:color w:val="333333"/>
           <w:sz w:val="19"/>
           <w:szCs w:val="19"/>
         </w:rPr>
@@ -5011,6 +4997,54 @@
           <w:szCs w:val="19"/>
         </w:rPr>
         <w:t>MCSA: Cloud Platform</w:t>
+      </w:r>
+      <w:r>
+        <w:rPr>
+          <w:rFonts w:ascii="Tahoma" w:eastAsiaTheme="minorHAnsi" w:hAnsi="Tahoma" w:cs="Tahoma"/>
+          <w:b w:val="0"/>
+          <w:color w:val="333333"/>
+          <w:spacing w:val="0"/>
+          <w:kern w:val="0"/>
+          <w:sz w:val="19"/>
+          <w:szCs w:val="19"/>
+        </w:rPr>
+        <w:t xml:space="preserve"> | </w:t>
+      </w:r>
+      <w:r>
+        <w:rPr>
+          <w:rFonts w:ascii="Tahoma" w:eastAsiaTheme="minorHAnsi" w:hAnsi="Tahoma" w:cs="Tahoma"/>
+          <w:b w:val="0"/>
+          <w:color w:val="333333"/>
+          <w:spacing w:val="0"/>
+          <w:kern w:val="0"/>
+          <w:sz w:val="19"/>
+          <w:szCs w:val="19"/>
+        </w:rPr>
+        <w:t>Microsoft Certified: Security, Compliance, and Identity Fundamentals</w:t>
+      </w:r>
+      <w:r>
+        <w:rPr>
+          <w:rFonts w:ascii="Tahoma" w:eastAsiaTheme="minorHAnsi" w:hAnsi="Tahoma" w:cs="Tahoma"/>
+          <w:b w:val="0"/>
+          <w:color w:val="333333"/>
+          <w:spacing w:val="0"/>
+          <w:kern w:val="0"/>
+          <w:sz w:val="19"/>
+          <w:szCs w:val="19"/>
+        </w:rPr>
+        <w:t xml:space="preserve"> | </w:t>
+      </w:r>
+      <w:r>
+        <w:rPr>
+          <w:rFonts w:ascii="Tahoma" w:eastAsiaTheme="minorHAnsi" w:hAnsi="Tahoma" w:cs="Tahoma"/>
+          <w:b w:val="0"/>
+          <w:color w:val="333333"/>
+          <w:spacing w:val="0"/>
+          <w:kern w:val="0"/>
+          <w:sz w:val="19"/>
+          <w:szCs w:val="19"/>
+        </w:rPr>
+        <w:t>Microsoft Azure AI Fundamentals</w:t>
       </w:r>
     </w:p>
     <w:p>
@@ -6865,7 +6899,6 @@
   <w:style w:type="character" w:default="1" w:styleId="DefaultParagraphFont">
     <w:name w:val="Default Paragraph Font"/>
     <w:uiPriority w:val="1"/>
-    <w:semiHidden/>
     <w:unhideWhenUsed/>
   </w:style>
   <w:style w:type="table" w:default="1" w:styleId="TableNormal">
@@ -7646,6 +7679,35 @@
 </file>
 
 <file path=customXml/item1.xml><?xml version="1.0" encoding="utf-8"?>
+<?mso-contentType ?>
+<FormTemplates xmlns="http://schemas.microsoft.com/sharepoint/v3/contenttype/forms">
+  <Display>DocumentLibraryForm</Display>
+  <Edit>DocumentLibraryForm</Edit>
+  <New>DocumentLibraryForm</New>
+</FormTemplates>
+</file>
+
+<file path=customXml/item2.xml><?xml version="1.0" encoding="utf-8"?>
+<p:properties xmlns:p="http://schemas.microsoft.com/office/2006/metadata/properties" xmlns:xsi="http://www.w3.org/2001/XMLSchema-instance" xmlns:pc="http://schemas.microsoft.com/office/infopath/2007/PartnerControls">
+  <documentManagement>
+    <_ip_UnifiedCompliancePolicyUIAction xmlns="http://schemas.microsoft.com/sharepoint/v3" xsi:nil="true"/>
+    <Image xmlns="71af3243-3dd4-4a8d-8c0d-dd76da1f02a5">
+      <Url xsi:nil="true"/>
+      <Description xsi:nil="true"/>
+    </Image>
+    <Status xmlns="71af3243-3dd4-4a8d-8c0d-dd76da1f02a5">Not started</Status>
+    <Background xmlns="71af3243-3dd4-4a8d-8c0d-dd76da1f02a5">false</Background>
+    <_ip_UnifiedCompliancePolicyProperties xmlns="http://schemas.microsoft.com/sharepoint/v3" xsi:nil="true"/>
+    <ImageTagsTaxHTField xmlns="71af3243-3dd4-4a8d-8c0d-dd76da1f02a5">
+      <Terms xmlns="http://schemas.microsoft.com/office/infopath/2007/PartnerControls"/>
+    </ImageTagsTaxHTField>
+    <TaxCatchAll xmlns="230e9df3-be65-4c73-a93b-d1236ebd677e" xsi:nil="true"/>
+    <MediaServiceKeyPoints xmlns="71af3243-3dd4-4a8d-8c0d-dd76da1f02a5" xsi:nil="true"/>
+  </documentManagement>
+</p:properties>
+</file>
+
+<file path=customXml/item3.xml><?xml version="1.0" encoding="utf-8"?>
 <ct:contentTypeSchema xmlns:ct="http://schemas.microsoft.com/office/2006/metadata/contentType" xmlns:ma="http://schemas.microsoft.com/office/2006/metadata/properties/metaAttributes" ct:_="" ma:_="" ma:contentTypeName="Document" ma:contentTypeID="0x01010079F111ED35F8CC479449609E8A0923A6" ma:contentTypeVersion="28" ma:contentTypeDescription="Create a new document." ma:contentTypeScope="" ma:versionID="60f5a4f2d2b0abadcf532d48ebf9cb71">
   <xsd:schema xmlns:xsd="http://www.w3.org/2001/XMLSchema" xmlns:xs="http://www.w3.org/2001/XMLSchema" xmlns:p="http://schemas.microsoft.com/office/2006/metadata/properties" xmlns:ns1="http://schemas.microsoft.com/sharepoint/v3" xmlns:ns2="71af3243-3dd4-4a8d-8c0d-dd76da1f02a5" xmlns:ns3="16c05727-aa75-4e4a-9b5f-8a80a1165891" xmlns:ns4="230e9df3-be65-4c73-a93b-d1236ebd677e" targetNamespace="http://schemas.microsoft.com/office/2006/metadata/properties" ma:root="true" ma:fieldsID="7dd78129e6a1811f84807ad11c651531" ns1:_="" ns2:_="" ns3:_="" ns4:_="">
     <xsd:import namespace="http://schemas.microsoft.com/sharepoint/v3"/>
@@ -7957,36 +8019,27 @@
 </ct:contentTypeSchema>
 </file>
 
-<file path=customXml/item2.xml><?xml version="1.0" encoding="utf-8"?>
-<p:properties xmlns:p="http://schemas.microsoft.com/office/2006/metadata/properties" xmlns:xsi="http://www.w3.org/2001/XMLSchema-instance" xmlns:pc="http://schemas.microsoft.com/office/infopath/2007/PartnerControls">
-  <documentManagement>
-    <_ip_UnifiedCompliancePolicyUIAction xmlns="http://schemas.microsoft.com/sharepoint/v3" xsi:nil="true"/>
-    <Image xmlns="71af3243-3dd4-4a8d-8c0d-dd76da1f02a5">
-      <Url xsi:nil="true"/>
-      <Description xsi:nil="true"/>
-    </Image>
-    <Status xmlns="71af3243-3dd4-4a8d-8c0d-dd76da1f02a5">Not started</Status>
-    <Background xmlns="71af3243-3dd4-4a8d-8c0d-dd76da1f02a5">false</Background>
-    <_ip_UnifiedCompliancePolicyProperties xmlns="http://schemas.microsoft.com/sharepoint/v3" xsi:nil="true"/>
-    <ImageTagsTaxHTField xmlns="71af3243-3dd4-4a8d-8c0d-dd76da1f02a5">
-      <Terms xmlns="http://schemas.microsoft.com/office/infopath/2007/PartnerControls"/>
-    </ImageTagsTaxHTField>
-    <TaxCatchAll xmlns="230e9df3-be65-4c73-a93b-d1236ebd677e" xsi:nil="true"/>
-    <MediaServiceKeyPoints xmlns="71af3243-3dd4-4a8d-8c0d-dd76da1f02a5" xsi:nil="true"/>
-  </documentManagement>
-</p:properties>
+<file path=customXml/itemProps1.xml><?xml version="1.0" encoding="utf-8"?>
+<ds:datastoreItem xmlns:ds="http://schemas.openxmlformats.org/officeDocument/2006/customXml" ds:itemID="{25DC269C-E6BD-4588-8075-DB6EF8D60A02}">
+  <ds:schemaRefs>
+    <ds:schemaRef ds:uri="http://schemas.microsoft.com/sharepoint/v3/contenttype/forms"/>
+  </ds:schemaRefs>
+</ds:datastoreItem>
 </file>
 
-<file path=customXml/item3.xml><?xml version="1.0" encoding="utf-8"?>
-<?mso-contentType ?>
-<FormTemplates xmlns="http://schemas.microsoft.com/sharepoint/v3/contenttype/forms">
-  <Display>DocumentLibraryForm</Display>
-  <Edit>DocumentLibraryForm</Edit>
-  <New>DocumentLibraryForm</New>
-</FormTemplates>
+<file path=customXml/itemProps2.xml><?xml version="1.0" encoding="utf-8"?>
+<ds:datastoreItem xmlns:ds="http://schemas.openxmlformats.org/officeDocument/2006/customXml" ds:itemID="{1CEEC261-E1A8-44C9-86EB-9B713B37503F}">
+  <ds:schemaRefs>
+    <ds:schemaRef ds:uri="http://schemas.microsoft.com/office/2006/metadata/properties"/>
+    <ds:schemaRef ds:uri="http://schemas.microsoft.com/office/infopath/2007/PartnerControls"/>
+    <ds:schemaRef ds:uri="http://schemas.microsoft.com/sharepoint/v3"/>
+    <ds:schemaRef ds:uri="71af3243-3dd4-4a8d-8c0d-dd76da1f02a5"/>
+    <ds:schemaRef ds:uri="230e9df3-be65-4c73-a93b-d1236ebd677e"/>
+  </ds:schemaRefs>
+</ds:datastoreItem>
 </file>
 
-<file path=customXml/itemProps1.xml><?xml version="1.0" encoding="utf-8"?>
+<file path=customXml/itemProps3.xml><?xml version="1.0" encoding="utf-8"?>
 <ds:datastoreItem xmlns:ds="http://schemas.openxmlformats.org/officeDocument/2006/customXml" ds:itemID="{C5A94A14-7132-4C09-B4AF-FEF146EA1357}">
   <ds:schemaRefs>
     <ds:schemaRef ds:uri="http://schemas.microsoft.com/office/2006/metadata/contentType"/>
@@ -8007,26 +8060,6 @@
 </ds:datastoreItem>
 </file>
 
-<file path=customXml/itemProps2.xml><?xml version="1.0" encoding="utf-8"?>
-<ds:datastoreItem xmlns:ds="http://schemas.openxmlformats.org/officeDocument/2006/customXml" ds:itemID="{1CEEC261-E1A8-44C9-86EB-9B713B37503F}">
-  <ds:schemaRefs>
-    <ds:schemaRef ds:uri="http://schemas.microsoft.com/office/2006/metadata/properties"/>
-    <ds:schemaRef ds:uri="http://schemas.microsoft.com/office/infopath/2007/PartnerControls"/>
-    <ds:schemaRef ds:uri="http://schemas.microsoft.com/sharepoint/v3"/>
-    <ds:schemaRef ds:uri="71af3243-3dd4-4a8d-8c0d-dd76da1f02a5"/>
-    <ds:schemaRef ds:uri="230e9df3-be65-4c73-a93b-d1236ebd677e"/>
-  </ds:schemaRefs>
-</ds:datastoreItem>
-</file>
-
-<file path=customXml/itemProps3.xml><?xml version="1.0" encoding="utf-8"?>
-<ds:datastoreItem xmlns:ds="http://schemas.openxmlformats.org/officeDocument/2006/customXml" ds:itemID="{25DC269C-E6BD-4588-8075-DB6EF8D60A02}">
-  <ds:schemaRefs>
-    <ds:schemaRef ds:uri="http://schemas.microsoft.com/sharepoint/v3/contenttype/forms"/>
-  </ds:schemaRefs>
-</ds:datastoreItem>
-</file>
-
 <file path=docMetadata/LabelInfo.xml><?xml version="1.0" encoding="utf-8"?>
 <clbl:labelList xmlns:clbl="http://schemas.microsoft.com/office/2020/mipLabelMetadata">
   <clbl:label id="{87ba5c36-b7cf-4793-bbc2-bd5b3a9f95ca}" enabled="1" method="Privileged" siteId="{72f988bf-86f1-41af-91ab-2d7cd011db47}" contentBits="0" removed="0"/>

</xml_diff>